<commit_message>
new chap 8 again
</commit_message>
<xml_diff>
--- a/chapters/GTIchap8.docx
+++ b/chapters/GTIchap8.docx
@@ -190,7 +190,7 @@
           <w:szCs w:val="28"/>
           <w:rtl w:val="0"/>
         </w:rPr>
-        <w:t xml:space="preserve">The only sound was the lapping of waves, and the only light, a sliver of moon cast down to dissipate upon the salty waters. The Sorceress slipped through the glass surface of the sea in darkness, her crew holding their tongues tightly and their breath tighter, hoping the creaks of the hull and splashes of the sea against it held only a gentle echo.</w:t>
+        <w:t xml:space="preserve">The only sound was the lapping of waves, and the only light, a sliver of moon cast down to dissipate upon the salty waters. The Sorceress slipped through the glass surface of the sea, her crew holding their tongues tightly and their breath tighter, hoping the creaks of the hull and splashes of the sea against it held only a gentle echo.</w:t>
       </w:r>
     </w:p>
     <w:p>
@@ -270,7 +270,7 @@
           <w:szCs w:val="28"/>
           <w:rtl w:val="0"/>
         </w:rPr>
-        <w:t xml:space="preserve">Glory peeked upwards to watch the stony ceiling cover her view of the stars, while Lovatt saw his cue to quietly move towards the anchor and begin lowering it into the black waves. Steadily, the chain disappeared link by link. </w:t>
+        <w:t xml:space="preserve">Glory glared upwards to watch the stony ceiling cover her view of the stars, while Lovatt saw his cue to quietly move towards the anchor and begin lowering it into the black waves. Steadily, the chain disappeared link by link. </w:t>
       </w:r>
     </w:p>
     <w:p>
@@ -310,47 +310,67 @@
           <w:szCs w:val="28"/>
           <w:rtl w:val="0"/>
         </w:rPr>
-        <w:t xml:space="preserve">Brynnis was the first to test its bearing, stepping from a crate and over the edge to stand on the ladder’s rail and shuffling silently across to the narrow walkway and finding his feet upon it. The ladder rattled as he stepped off, and Verne tightened his grip on its rail as Glory took the second journey to the cliff. Brynnis hugged the crag, his back to the sea, his oversized hands wide and pressed into the mossy stone. </w:t>
-      </w:r>
-    </w:p>
-    <w:p>
-      <w:pPr>
-        <w:rPr>
-          <w:rFonts w:ascii="Montserrat" w:cs="Montserrat" w:eastAsia="Montserrat" w:hAnsi="Montserrat"/>
-          <w:color w:val="ffffff"/>
-          <w:sz w:val="28"/>
-          <w:szCs w:val="28"/>
-        </w:rPr>
-      </w:pPr>
-      <w:r>
-        <w:rPr>
-          <w:rFonts w:ascii="Montserrat" w:cs="Montserrat" w:eastAsia="Montserrat" w:hAnsi="Montserrat"/>
-          <w:color w:val="ffffff"/>
-          <w:sz w:val="28"/>
-          <w:szCs w:val="28"/>
-          <w:rtl w:val="0"/>
-        </w:rPr>
-        <w:t xml:space="preserve">The roof of rock over their heads shielded them from a watchful gaze, yet also from any light the night had to offer them, and each step was made slowly in the pitch dark. Verne made his way next, watching Brynnis disappear into shadow and Glory follow closely behind him, and his heart stopped for just a second as he reached the middle of the ladder and looked down into the glossy ripples waiting to swallow him from below. </w:t>
-      </w:r>
-    </w:p>
-    <w:p>
-      <w:pPr>
-        <w:rPr>
-          <w:rFonts w:ascii="Montserrat" w:cs="Montserrat" w:eastAsia="Montserrat" w:hAnsi="Montserrat"/>
-          <w:color w:val="ffffff"/>
-          <w:sz w:val="28"/>
-          <w:szCs w:val="28"/>
-        </w:rPr>
-      </w:pPr>
-      <w:r>
-        <w:rPr>
-          <w:rFonts w:ascii="Montserrat" w:cs="Montserrat" w:eastAsia="Montserrat" w:hAnsi="Montserrat"/>
-          <w:color w:val="ffffff"/>
-          <w:sz w:val="28"/>
-          <w:szCs w:val="28"/>
-          <w:rtl w:val="0"/>
-        </w:rPr>
-        <w:t xml:space="preserve">He waited as the boat drifted back to a steady position. Then, he tiptoed over the rungs and grabbed the wall to release his breath upon it in a great rush of energy. </w:t>
+        <w:t xml:space="preserve">Brynnis was the first to test its bearing, stepping from a crate and over the edge to stand on the ladder’s rail and shuffling silently across to the narrow walkway and steadying himself upon it. The ladder rattled as he stepped off, and Verne tightened his grip on its rail as Glory took the second journey to the cliff. </w:t>
+      </w:r>
+    </w:p>
+    <w:p>
+      <w:pPr>
+        <w:rPr>
+          <w:rFonts w:ascii="Montserrat" w:cs="Montserrat" w:eastAsia="Montserrat" w:hAnsi="Montserrat"/>
+          <w:color w:val="ffffff"/>
+          <w:sz w:val="28"/>
+          <w:szCs w:val="28"/>
+        </w:rPr>
+      </w:pPr>
+      <w:r>
+        <w:rPr>
+          <w:rFonts w:ascii="Montserrat" w:cs="Montserrat" w:eastAsia="Montserrat" w:hAnsi="Montserrat"/>
+          <w:color w:val="ffffff"/>
+          <w:sz w:val="28"/>
+          <w:szCs w:val="28"/>
+          <w:rtl w:val="0"/>
+        </w:rPr>
+        <w:t xml:space="preserve">Brynnis hugged the crag, his back to the sea, his oversized hands wide and pressed into the mossy stone. </w:t>
+      </w:r>
+    </w:p>
+    <w:p>
+      <w:pPr>
+        <w:rPr>
+          <w:rFonts w:ascii="Montserrat" w:cs="Montserrat" w:eastAsia="Montserrat" w:hAnsi="Montserrat"/>
+          <w:color w:val="ffffff"/>
+          <w:sz w:val="28"/>
+          <w:szCs w:val="28"/>
+        </w:rPr>
+      </w:pPr>
+      <w:r>
+        <w:rPr>
+          <w:rFonts w:ascii="Montserrat" w:cs="Montserrat" w:eastAsia="Montserrat" w:hAnsi="Montserrat"/>
+          <w:color w:val="ffffff"/>
+          <w:sz w:val="28"/>
+          <w:szCs w:val="28"/>
+          <w:rtl w:val="0"/>
+        </w:rPr>
+        <w:t xml:space="preserve">The roof of rock over their heads shielded them from a watchful gaze, yet also from any light the night had to offer them, and each step was taken with caution in the pitch black. </w:t>
+      </w:r>
+    </w:p>
+    <w:p>
+      <w:pPr>
+        <w:rPr>
+          <w:rFonts w:ascii="Montserrat" w:cs="Montserrat" w:eastAsia="Montserrat" w:hAnsi="Montserrat"/>
+          <w:color w:val="ffffff"/>
+          <w:sz w:val="28"/>
+          <w:szCs w:val="28"/>
+        </w:rPr>
+      </w:pPr>
+      <w:r>
+        <w:rPr>
+          <w:rFonts w:ascii="Montserrat" w:cs="Montserrat" w:eastAsia="Montserrat" w:hAnsi="Montserrat"/>
+          <w:color w:val="ffffff"/>
+          <w:sz w:val="28"/>
+          <w:szCs w:val="28"/>
+          <w:rtl w:val="0"/>
+        </w:rPr>
+        <w:t xml:space="preserve">Verne started next, watching Brynnis disappear into shadow and Glory follow closely behind him, and his heart stopped for just a second as he reached the middle of the ladder and looked down into the glossy ripples waiting to swallow him from below. He waited as the boat drifted back to a steady position. Then, he tiptoed over the rungs and grabbed the wall to release his breath upon it in a great rush of energy. </w:t>
       </w:r>
     </w:p>
     <w:p>
@@ -450,27 +470,27 @@
           <w:szCs w:val="28"/>
           <w:rtl w:val="0"/>
         </w:rPr>
-        <w:t xml:space="preserve">Brynnis made his way into the hollow, pulling a torchlight from his belt clip and switching it on to see the plain surfaces of a hall carved by heavy machinery suddenly appear in an otherwise natural crevice. Decades of dripping water had stained the walls a light pinkish green, and small mounds of solidified sediment rested where they met the floor. </w:t>
-      </w:r>
-    </w:p>
-    <w:p>
-      <w:pPr>
-        <w:rPr>
-          <w:rFonts w:ascii="Montserrat" w:cs="Montserrat" w:eastAsia="Montserrat" w:hAnsi="Montserrat"/>
-          <w:color w:val="ffffff"/>
-          <w:sz w:val="28"/>
-          <w:szCs w:val="28"/>
-        </w:rPr>
-      </w:pPr>
-      <w:r>
-        <w:rPr>
-          <w:rFonts w:ascii="Montserrat" w:cs="Montserrat" w:eastAsia="Montserrat" w:hAnsi="Montserrat"/>
-          <w:color w:val="ffffff"/>
-          <w:sz w:val="28"/>
-          <w:szCs w:val="28"/>
-          <w:rtl w:val="0"/>
-        </w:rPr>
-        <w:t xml:space="preserve">They each made their steady way through the corridor, with soft steps and breaths, then stopped at the sight of a great titanium door ahead of them.</w:t>
+        <w:t xml:space="preserve">Brynnis headed into the hollow, pulling a torchlight from his belt clip and switching it on to see the plain surfaces of a hall carved by heavy machinery suddenly appear in an otherwise natural crevice. Decades of dripping water had stained the walls a light pinkish green, and small mounds of solidified sediment rested where they met the floor. </w:t>
+      </w:r>
+    </w:p>
+    <w:p>
+      <w:pPr>
+        <w:rPr>
+          <w:rFonts w:ascii="Montserrat" w:cs="Montserrat" w:eastAsia="Montserrat" w:hAnsi="Montserrat"/>
+          <w:color w:val="ffffff"/>
+          <w:sz w:val="28"/>
+          <w:szCs w:val="28"/>
+        </w:rPr>
+      </w:pPr>
+      <w:r>
+        <w:rPr>
+          <w:rFonts w:ascii="Montserrat" w:cs="Montserrat" w:eastAsia="Montserrat" w:hAnsi="Montserrat"/>
+          <w:color w:val="ffffff"/>
+          <w:sz w:val="28"/>
+          <w:szCs w:val="28"/>
+          <w:rtl w:val="0"/>
+        </w:rPr>
+        <w:t xml:space="preserve">They each made their way through the corridor, with soft steps and breaths, then stopped at the sight of a great titanium door ahead of them.</w:t>
       </w:r>
     </w:p>
     <w:p>
@@ -512,7 +532,7 @@
           <w:szCs w:val="28"/>
           <w:rtl w:val="0"/>
         </w:rPr>
-        <w:t xml:space="preserve">“They will be,” said Glory. “See you on the other side," she added in a quiet whisper.</w:t>
+        <w:t xml:space="preserve">“They will be,” said Glory. “See you on the other side," she added, still lowering her voice to approach silence.</w:t>
       </w:r>
     </w:p>
     <w:p>
@@ -553,7 +573,27 @@
           <w:szCs w:val="28"/>
           <w:rtl w:val="0"/>
         </w:rPr>
-        <w:t xml:space="preserve">Then, he was gone before her eyes, leaving only a mirage in the air and a flicker of his form where he had stood a moment before. He had entered Realmspace, a bizarre and energetic mirror of Eydtea, and a world of great mystery to all but the Menyantic peoples.</w:t>
+        <w:t xml:space="preserve">Then, he was disappeared before her eyes, leaving only a mirage in the air and a flicker of his form where he had stood a moment before. </w:t>
+      </w:r>
+    </w:p>
+    <w:p>
+      <w:pPr>
+        <w:rPr>
+          <w:rFonts w:ascii="Montserrat" w:cs="Montserrat" w:eastAsia="Montserrat" w:hAnsi="Montserrat"/>
+          <w:color w:val="ffffff"/>
+          <w:sz w:val="28"/>
+          <w:szCs w:val="28"/>
+        </w:rPr>
+      </w:pPr>
+      <w:r>
+        <w:rPr>
+          <w:rFonts w:ascii="Montserrat" w:cs="Montserrat" w:eastAsia="Montserrat" w:hAnsi="Montserrat"/>
+          <w:color w:val="ffffff"/>
+          <w:sz w:val="28"/>
+          <w:szCs w:val="28"/>
+          <w:rtl w:val="0"/>
+        </w:rPr>
+        <w:t xml:space="preserve">He had entered Realm.</w:t>
       </w:r>
     </w:p>
     <w:p>
@@ -643,47 +683,109 @@
           <w:szCs w:val="28"/>
           <w:rtl w:val="0"/>
         </w:rPr>
-        <w:t xml:space="preserve">He stepped forward and each of his footprints puffed with a burst of blue and orange particulates. Every movement, every stride cast a negative shadow of his previous position, a reflection of pure chronia, fading gradually into the negaspace to leave only a few frail sparks. He laid his hand on the glass, felt its temperature rapidly align with his own until it felt like he was touching no mass at all. His skin seemed to fade into the space, there was no true darkness here. But, even so, it was still a place in which to become hopelessly lost in the sensation of unreality that unfolded around its visitors.</w:t>
-      </w:r>
-    </w:p>
-    <w:p>
-      <w:pPr>
-        <w:rPr>
-          <w:rFonts w:ascii="Montserrat" w:cs="Montserrat" w:eastAsia="Montserrat" w:hAnsi="Montserrat"/>
-          <w:color w:val="ffffff"/>
-          <w:sz w:val="28"/>
-          <w:szCs w:val="28"/>
-        </w:rPr>
-      </w:pPr>
-      <w:r>
-        <w:rPr>
-          <w:rFonts w:ascii="Montserrat" w:cs="Montserrat" w:eastAsia="Montserrat" w:hAnsi="Montserrat"/>
-          <w:color w:val="ffffff"/>
-          <w:sz w:val="28"/>
-          <w:szCs w:val="28"/>
-          <w:rtl w:val="0"/>
-        </w:rPr>
-        <w:t xml:space="preserve">A few more steps, and he began to feel lightheaded and compressed, breathing out slowly to see the expired air unfold as fine and floral smoke before him. He composed himself and slipped through the gap in the wall.</w:t>
-      </w:r>
-    </w:p>
-    <w:p>
-      <w:pPr>
-        <w:rPr>
-          <w:rFonts w:ascii="Montserrat" w:cs="Montserrat" w:eastAsia="Montserrat" w:hAnsi="Montserrat"/>
-          <w:color w:val="ffffff"/>
-          <w:sz w:val="28"/>
-          <w:szCs w:val="28"/>
-        </w:rPr>
-      </w:pPr>
-      <w:r>
-        <w:rPr>
-          <w:rFonts w:ascii="Montserrat" w:cs="Montserrat" w:eastAsia="Montserrat" w:hAnsi="Montserrat"/>
-          <w:color w:val="ffffff"/>
-          <w:sz w:val="28"/>
-          <w:szCs w:val="28"/>
-          <w:rtl w:val="0"/>
-        </w:rPr>
-        <w:t xml:space="preserve">He could have been there for a minute, a day, or a year, each stretch felt very much the same to the unsensing body. Glancing down at his chest, he closed his fist, and with a flash of concentration, returned to reality, the darkness almost scaring him as it wrapped itself around him. He knelt quickly down, and allowed his eyes to adjust to the room beyond the door; a large chamber with iron pillars twisting up to the ceiling, the dim light from a single strip encased in a glass frame on one of the far wall. He turned to the door and rose, orienting himself and finding his feet. </w:t>
+        <w:t xml:space="preserve">He stepped forward and each of his footprints puffed with a burst of blue and orange particulates. Every movement, every stride cast a negative shadow of his previous position, a reflection of pure chronia, fading gradually into the negaspace to leave only a few frail sparks. He laid his hand on the glass, felt its temperature rapidly align with his own until it felt like he was touching no mass at all. His skin seemed to fade into the space, there was no true </w:t>
+      </w:r>
+      <w:r>
+        <w:rPr>
+          <w:rFonts w:ascii="Montserrat" w:cs="Montserrat" w:eastAsia="Montserrat" w:hAnsi="Montserrat"/>
+          <w:i w:val="1"/>
+          <w:iCs w:val="1"/>
+          <w:color w:val="ffffff"/>
+          <w:sz w:val="28"/>
+          <w:szCs w:val="28"/>
+          <w:rtl w:val="0"/>
+        </w:rPr>
+        <w:t xml:space="preserve">darkness </w:t>
+      </w:r>
+      <w:r>
+        <w:rPr>
+          <w:rFonts w:ascii="Montserrat" w:cs="Montserrat" w:eastAsia="Montserrat" w:hAnsi="Montserrat"/>
+          <w:color w:val="ffffff"/>
+          <w:sz w:val="28"/>
+          <w:szCs w:val="28"/>
+          <w:rtl w:val="0"/>
+        </w:rPr>
+        <w:t xml:space="preserve">here, despite the void that stretched on for infinity. </w:t>
+      </w:r>
+    </w:p>
+    <w:p>
+      <w:pPr>
+        <w:rPr>
+          <w:rFonts w:ascii="Montserrat" w:cs="Montserrat" w:eastAsia="Montserrat" w:hAnsi="Montserrat"/>
+          <w:color w:val="ffffff"/>
+          <w:sz w:val="28"/>
+          <w:szCs w:val="28"/>
+        </w:rPr>
+      </w:pPr>
+      <w:r>
+        <w:rPr>
+          <w:rFonts w:ascii="Montserrat" w:cs="Montserrat" w:eastAsia="Montserrat" w:hAnsi="Montserrat"/>
+          <w:color w:val="ffffff"/>
+          <w:sz w:val="28"/>
+          <w:szCs w:val="28"/>
+          <w:rtl w:val="0"/>
+        </w:rPr>
+        <w:t xml:space="preserve">Even so, it was still a place in which to become hopelessly lost in the sensation of unreality that unfolded around its visitors.</w:t>
+      </w:r>
+    </w:p>
+    <w:p>
+      <w:pPr>
+        <w:rPr>
+          <w:rFonts w:ascii="Montserrat" w:cs="Montserrat" w:eastAsia="Montserrat" w:hAnsi="Montserrat"/>
+          <w:color w:val="ffffff"/>
+          <w:sz w:val="28"/>
+          <w:szCs w:val="28"/>
+        </w:rPr>
+      </w:pPr>
+      <w:r>
+        <w:rPr>
+          <w:rFonts w:ascii="Montserrat" w:cs="Montserrat" w:eastAsia="Montserrat" w:hAnsi="Montserrat"/>
+          <w:color w:val="ffffff"/>
+          <w:sz w:val="28"/>
+          <w:szCs w:val="28"/>
+          <w:rtl w:val="0"/>
+        </w:rPr>
+        <w:t xml:space="preserve">A few more steps, and he began to feel lightheaded and compressed, breathing out in slow motion to see the expired air unfold as fine and floral smoke before him. He composed himself and slipped through the gap in the wall.</w:t>
+      </w:r>
+    </w:p>
+    <w:p>
+      <w:pPr>
+        <w:rPr>
+          <w:rFonts w:ascii="Montserrat" w:cs="Montserrat" w:eastAsia="Montserrat" w:hAnsi="Montserrat"/>
+          <w:color w:val="ffffff"/>
+          <w:sz w:val="28"/>
+          <w:szCs w:val="28"/>
+        </w:rPr>
+      </w:pPr>
+      <w:r>
+        <w:rPr>
+          <w:rFonts w:ascii="Montserrat" w:cs="Montserrat" w:eastAsia="Montserrat" w:hAnsi="Montserrat"/>
+          <w:color w:val="ffffff"/>
+          <w:sz w:val="28"/>
+          <w:szCs w:val="28"/>
+          <w:rtl w:val="0"/>
+        </w:rPr>
+        <w:t xml:space="preserve">He could have been there for a minute, a day, or a year, each stretch felt very much the same to the unsensing body. Glancing down at his chest, he closed his fist, and with a flash of concentration, returned to reality, the shadows of the Real almost scaring him as they wrapped themselves around him. </w:t>
+      </w:r>
+    </w:p>
+    <w:p>
+      <w:pPr>
+        <w:rPr>
+          <w:rFonts w:ascii="Montserrat" w:cs="Montserrat" w:eastAsia="Montserrat" w:hAnsi="Montserrat"/>
+          <w:color w:val="ffffff"/>
+          <w:sz w:val="28"/>
+          <w:szCs w:val="28"/>
+        </w:rPr>
+      </w:pPr>
+      <w:r>
+        <w:rPr>
+          <w:rFonts w:ascii="Montserrat" w:cs="Montserrat" w:eastAsia="Montserrat" w:hAnsi="Montserrat"/>
+          <w:color w:val="ffffff"/>
+          <w:sz w:val="28"/>
+          <w:szCs w:val="28"/>
+          <w:rtl w:val="0"/>
+        </w:rPr>
+        <w:t xml:space="preserve">He knelt quickly down, and allowed his eyes to adjust to the room beyond the door; a large chamber with iron pillars twisting up to the ceiling, the dim light from a single strip encased in a glass frame on one of the far walls. He turned to the door and rose, orienting himself and finding his feet. </w:t>
       </w:r>
     </w:p>
     <w:p>
@@ -753,7 +855,7 @@
           <w:szCs w:val="28"/>
           <w:rtl w:val="0"/>
         </w:rPr>
-        <w:t xml:space="preserve">Glory leaned against the flat wall, and scratched at her freckled nose, picking off a little dead skin from the bridge and rolling it under her fingernail. Then, she heard the door click. They braced themselves, and she smiled ever so slyly, watching the door swing slowly open and a confident Brynnis revealed behind it.</w:t>
+        <w:t xml:space="preserve">Glory leaned against the flat wall, and scratched at her freckled nose, picking off a little dead skin from the bridge and rolling it under her fingernail. Then, she heard the door click. They braced themselves, and she smiled ever so slyly, watching the door swing open and a confident Brynnis revealed behind it.</w:t>
       </w:r>
     </w:p>
     <w:p>
@@ -815,7 +917,7 @@
           <w:szCs w:val="28"/>
           <w:rtl w:val="0"/>
         </w:rPr>
-        <w:t xml:space="preserve">“We’re right here," he whispered, and tried his best to use the very tip of his finger to indicate a small rectangle at the head of a snaking path, one of many divorced segments of shapes decorating the page. “This is cellar three. Up those steps and we’re in the west outer ring hall, ground level.”</w:t>
+        <w:t xml:space="preserve">“We’re right here," he murmered, and tried his best to use the very tip of his finger to indicate a small rectangle at the head of a snaking path, one of many divorced segments of shapes decorating the page. “This is cellar three. Up those steps and we’re in the west outer ring hall, ground level.”</w:t>
       </w:r>
     </w:p>
     <w:p>
@@ -856,7 +958,29 @@
           <w:szCs w:val="28"/>
           <w:rtl w:val="0"/>
         </w:rPr>
-        <w:t xml:space="preserve">“You sure you’re ready? Got your knife?” whispered Glory, watching his hands as Brynn unsheathed a narrow, curved blade and gripped its handle, rubbing the hilt with a nervous thumb. It seemed Verne had already moved over to the barred door across the room, peered through at the stairwell beyond, caked in a shallow darkness. He knelt beside the lock and began to explore its innards with a pair of his own fine blades, twisting one way or the other, prodding and pushing at its bones until they clicked into place.</w:t>
+        <w:t xml:space="preserve">“You sure you’re ready? Got your </w:t>
+      </w:r>
+      <w:r>
+        <w:rPr>
+          <w:rFonts w:ascii="Montserrat" w:cs="Montserrat" w:eastAsia="Montserrat" w:hAnsi="Montserrat"/>
+          <w:i w:val="1"/>
+          <w:iCs w:val="1"/>
+          <w:color w:val="ffffff"/>
+          <w:sz w:val="28"/>
+          <w:szCs w:val="28"/>
+          <w:rtl w:val="0"/>
+        </w:rPr>
+        <w:t xml:space="preserve">magic </w:t>
+      </w:r>
+      <w:r>
+        <w:rPr>
+          <w:rFonts w:ascii="Montserrat" w:cs="Montserrat" w:eastAsia="Montserrat" w:hAnsi="Montserrat"/>
+          <w:color w:val="ffffff"/>
+          <w:sz w:val="28"/>
+          <w:szCs w:val="28"/>
+          <w:rtl w:val="0"/>
+        </w:rPr>
+        <w:t xml:space="preserve">knife?” whispered Glory, watching his hands as Brynn unsheathed a narrow, curved blade and gripped its handle, rubbing the hilt with a nervous thumb. It seemed Verne had already moved over to the barred door across the room, peered through at the stairwell beyond, caked in a shallow darkness. He knelt beside the lock and began to explore its innards with a pair of his own fine blades, twisting one way or the other, prodding and pushing at its bones until they clicked into place.</w:t>
       </w:r>
     </w:p>
     <w:p>
@@ -877,7 +1001,7 @@
           <w:rtl w:val="0"/>
         </w:rPr>
         <w:tab/>
-        <w:t xml:space="preserve">“It’s open…” whispered Verne, retracting his picks and pocketing them beside his chest.</w:t>
+        <w:t xml:space="preserve">“It’s open…” said Verne, retracting his picks and pocketing them beside his chest.</w:t>
       </w:r>
     </w:p>
     <w:p>
@@ -945,6 +1069,7 @@
     </w:p>
     <w:p>
       <w:pPr>
+        <w:ind w:left="0" w:firstLine="0"/>
         <w:rPr>
           <w:rFonts w:ascii="Montserrat" w:cs="Montserrat" w:eastAsia="Montserrat" w:hAnsi="Montserrat"/>
           <w:color w:val="ffffff"/>
@@ -980,83 +1105,103 @@
           <w:szCs w:val="28"/>
           <w:rtl w:val="0"/>
         </w:rPr>
-        <w:t xml:space="preserve">The barred frame snapped free of its lock, and swung slowly ajar with Verne’s hand on the cold metal to steady its pace, the hinges squealing ever so lightly, like a mouse suffocating in a sealed wooden box.</w:t>
-      </w:r>
-    </w:p>
-    <w:p>
-      <w:pPr>
-        <w:rPr>
-          <w:rFonts w:ascii="Montserrat" w:cs="Montserrat" w:eastAsia="Montserrat" w:hAnsi="Montserrat"/>
-          <w:color w:val="ffffff"/>
-          <w:sz w:val="28"/>
-          <w:szCs w:val="28"/>
-        </w:rPr>
-      </w:pPr>
-      <w:r>
-        <w:rPr>
-          <w:rtl w:val="0"/>
-        </w:rPr>
-      </w:r>
-    </w:p>
-    <w:p>
-      <w:pPr>
-        <w:rPr>
-          <w:rFonts w:ascii="Montserrat" w:cs="Montserrat" w:eastAsia="Montserrat" w:hAnsi="Montserrat"/>
-          <w:color w:val="ffffff"/>
-          <w:sz w:val="28"/>
-          <w:szCs w:val="28"/>
-        </w:rPr>
-      </w:pPr>
-      <w:r>
-        <w:rPr>
-          <w:rFonts w:ascii="Montserrat" w:cs="Montserrat" w:eastAsia="Montserrat" w:hAnsi="Montserrat"/>
-          <w:color w:val="ffffff"/>
-          <w:sz w:val="28"/>
-          <w:szCs w:val="28"/>
-          <w:rtl w:val="0"/>
-        </w:rPr>
-        <w:t xml:space="preserve">At the top of the steps, the passage became darker and welcomed the trio into an archway adjoined to the middle of a narrow corridor. The electric light from beneath them faded away, replaced by the buttery glow of firelight. </w:t>
-      </w:r>
-    </w:p>
-    <w:p>
-      <w:pPr>
-        <w:rPr>
-          <w:rFonts w:ascii="Montserrat" w:cs="Montserrat" w:eastAsia="Montserrat" w:hAnsi="Montserrat"/>
-          <w:color w:val="ffffff"/>
-          <w:sz w:val="28"/>
-          <w:szCs w:val="28"/>
-        </w:rPr>
-      </w:pPr>
-      <w:r>
-        <w:rPr>
-          <w:rFonts w:ascii="Montserrat" w:cs="Montserrat" w:eastAsia="Montserrat" w:hAnsi="Montserrat"/>
-          <w:color w:val="ffffff"/>
-          <w:sz w:val="28"/>
-          <w:szCs w:val="28"/>
-          <w:rtl w:val="0"/>
-        </w:rPr>
-        <w:t xml:space="preserve">Brynn placed his blade flat between his teeth, and held it firmly, his tongue tucking itself fearfully away, close to his throat as they each crouched in the arch. Glory peeked around the corner to see a man perched at a desk, scribbling away at a book. It was the quartermaster, tallying his supplies, humming to himself. The sound of plucked strings moved through the air, flowing from the desk to the far end of the hall.</w:t>
-      </w:r>
-    </w:p>
-    <w:p>
-      <w:pPr>
-        <w:ind w:firstLine="720"/>
-        <w:rPr>
-          <w:rFonts w:ascii="Montserrat" w:cs="Montserrat" w:eastAsia="Montserrat" w:hAnsi="Montserrat"/>
-          <w:color w:val="ffffff"/>
-          <w:sz w:val="28"/>
-          <w:szCs w:val="28"/>
-        </w:rPr>
-      </w:pPr>
-      <w:r>
-        <w:rPr>
-          <w:rFonts w:ascii="Montserrat" w:cs="Montserrat" w:eastAsia="Montserrat" w:hAnsi="Montserrat"/>
-          <w:color w:val="ffffff"/>
-          <w:sz w:val="28"/>
-          <w:szCs w:val="28"/>
-          <w:rtl w:val="0"/>
-        </w:rPr>
-        <w:t xml:space="preserve">“Don’t slit his throat, we can use the uniform, looks about Verne’s size,” whispered Glory, as the tune picked at her memory, placing the simple melody in Astrum. “Huh, they can pick up the Silver Star from here…”</w:t>
+        <w:t xml:space="preserve">The barred frame snapped free of its lock, and swung ajar with Verne’s hand on the cold metal to steady its pace, the hinges squealing ever so lightly, like a mouse suffocating in a sealed wooden box.</w:t>
+      </w:r>
+    </w:p>
+    <w:p>
+      <w:pPr>
+        <w:rPr>
+          <w:rFonts w:ascii="Montserrat" w:cs="Montserrat" w:eastAsia="Montserrat" w:hAnsi="Montserrat"/>
+          <w:color w:val="ffffff"/>
+          <w:sz w:val="28"/>
+          <w:szCs w:val="28"/>
+        </w:rPr>
+      </w:pPr>
+      <w:r>
+        <w:rPr>
+          <w:rtl w:val="0"/>
+        </w:rPr>
+      </w:r>
+    </w:p>
+    <w:p>
+      <w:pPr>
+        <w:rPr>
+          <w:rFonts w:ascii="Montserrat" w:cs="Montserrat" w:eastAsia="Montserrat" w:hAnsi="Montserrat"/>
+          <w:color w:val="ffffff"/>
+          <w:sz w:val="28"/>
+          <w:szCs w:val="28"/>
+        </w:rPr>
+      </w:pPr>
+      <w:r>
+        <w:rPr>
+          <w:rFonts w:ascii="Montserrat" w:cs="Montserrat" w:eastAsia="Montserrat" w:hAnsi="Montserrat"/>
+          <w:color w:val="ffffff"/>
+          <w:sz w:val="28"/>
+          <w:szCs w:val="28"/>
+          <w:rtl w:val="0"/>
+        </w:rPr>
+        <w:t xml:space="preserve">At the top of the steps, the passage became welcomed the trio into an archway adjoined to the middle of a narrow corridor. The electric light from beneath them faded away, replaced by the buttery glow of firelight. </w:t>
+      </w:r>
+    </w:p>
+    <w:p>
+      <w:pPr>
+        <w:rPr>
+          <w:rFonts w:ascii="Montserrat" w:cs="Montserrat" w:eastAsia="Montserrat" w:hAnsi="Montserrat"/>
+          <w:color w:val="ffffff"/>
+          <w:sz w:val="28"/>
+          <w:szCs w:val="28"/>
+        </w:rPr>
+      </w:pPr>
+      <w:r>
+        <w:rPr>
+          <w:rFonts w:ascii="Montserrat" w:cs="Montserrat" w:eastAsia="Montserrat" w:hAnsi="Montserrat"/>
+          <w:color w:val="ffffff"/>
+          <w:sz w:val="28"/>
+          <w:szCs w:val="28"/>
+          <w:rtl w:val="0"/>
+        </w:rPr>
+        <w:t xml:space="preserve">Brynn placed his blade flat between his teeth, and held it firmly, his tongue tucking itself fearfully away, close to his throat as they each crouched in the arch. </w:t>
+      </w:r>
+    </w:p>
+    <w:p>
+      <w:pPr>
+        <w:rPr>
+          <w:rFonts w:ascii="Montserrat" w:cs="Montserrat" w:eastAsia="Montserrat" w:hAnsi="Montserrat"/>
+          <w:color w:val="ffffff"/>
+          <w:sz w:val="28"/>
+          <w:szCs w:val="28"/>
+        </w:rPr>
+      </w:pPr>
+      <w:r>
+        <w:rPr>
+          <w:rFonts w:ascii="Montserrat" w:cs="Montserrat" w:eastAsia="Montserrat" w:hAnsi="Montserrat"/>
+          <w:color w:val="ffffff"/>
+          <w:sz w:val="28"/>
+          <w:szCs w:val="28"/>
+          <w:rtl w:val="0"/>
+        </w:rPr>
+        <w:t xml:space="preserve">Glory peered around the corner to see a man perched at a desk, scribbling away at a book. It was the quartermaster, tallying his supplies, humming to himself. The sound of plucked strings moved through the air, flowing from the desk to the far end of the hall.</w:t>
+      </w:r>
+    </w:p>
+    <w:p>
+      <w:pPr>
+        <w:ind w:firstLine="720"/>
+        <w:rPr>
+          <w:rFonts w:ascii="Montserrat" w:cs="Montserrat" w:eastAsia="Montserrat" w:hAnsi="Montserrat"/>
+          <w:color w:val="ffffff"/>
+          <w:sz w:val="28"/>
+          <w:szCs w:val="28"/>
+        </w:rPr>
+      </w:pPr>
+      <w:r>
+        <w:rPr>
+          <w:rFonts w:ascii="Montserrat" w:cs="Montserrat" w:eastAsia="Montserrat" w:hAnsi="Montserrat"/>
+          <w:color w:val="ffffff"/>
+          <w:sz w:val="28"/>
+          <w:szCs w:val="28"/>
+          <w:rtl w:val="0"/>
+        </w:rPr>
+        <w:t xml:space="preserve">“Don’t slit his throat, we can use the uniform, looks about Verne’s size,” breathed Glory, as the tune picked at her memory, placing the simple melody in Astrum. “Huh, they can pick up the Silver Star from here…”</w:t>
       </w:r>
     </w:p>
     <w:p>
@@ -1077,7 +1222,7 @@
           <w:szCs w:val="28"/>
           <w:rtl w:val="0"/>
         </w:rPr>
-        <w:t xml:space="preserve">Before she could utter another hushed word, Brynn disappeared from her plane of reality, the wake of his movement warming her skin and blowing her loose fringe over her eyes. She peeked again, and saw only a familiar pair of hands emerge, disembodied, and wrap themselves tightly around the guard’s neck. His eyes bulged, he squealed and squawked, he grabbed his pen and swung it behind him, only to find nothing at all to stab at. His strength fell away before Glory’s eyes, and she smiled to see it. The hands squeezed reddening flesh, and as the guard’s own fell helplessly down to his sides, Verne stepped out and towards him. </w:t>
+        <w:t xml:space="preserve">Before she could utter another hushed word, Brynn disappeared from her plane of reality, the wake of his movement warming her skin and blowing her loose fringe over her eyes. She snuck a look again, and saw only a familiar pair of hands emerge, disembodied, and wrap themselves tightly around the guard’s neck. His eyes bulged, he squealed and squawked, he grabbed his pen and swung it behind him, only to find nothing at all to stab at. His strength fell away before Glory’s eyes, and she smiled to see it. The hands squeezed reddening flesh, and as the guard’s own fell helplessly down to his sides, Verne stepped out and towards him. </w:t>
       </w:r>
     </w:p>
     <w:p>
@@ -1098,7 +1243,7 @@
           <w:rtl w:val="0"/>
         </w:rPr>
         <w:tab/>
-        <w:t xml:space="preserve">“Hello," he whispered, staring down at the bubbles of saliva growing from the man’s dying lips, and the burst veins in his eyes. Still, Brynn wrought the neck, until Glory’s hand laid onto his own, caressing his fingers, and he released his grip to disappear entirely back into Realm. “Bit creepy, in’tit," said Verne, before grabbing the dying man by the hair and pulling him back to lean him upright, then he pressed his own hands down on the bruised flesh of his neck.</w:t>
+        <w:t xml:space="preserve">“Hello," he said, staring down at the bubbles of saliva growing from the man’s dying lips, and the burst veins in his eyes. Still, Brynn wrought the neck, until Glory’s hand laid onto his own, caressing his fingers, and he released his grip to disappear entirely back into Realm. “Bit creepy, in’tit," said Verne, before grabbing the dying man by the hair and pulling him back to lean him upright, then he pressed his own hands down on the bruised flesh of his neck.</w:t>
       </w:r>
     </w:p>
     <w:p>
@@ -1487,7 +1632,7 @@
           <w:szCs w:val="28"/>
           <w:rtl w:val="0"/>
         </w:rPr>
-        <w:t xml:space="preserve">“Oh, you look very fancy in that," said Glory, and they made their way back to Platt’s desk with a flutter of excitement for the evening to come. “With the helmet on, anyway.”</w:t>
+        <w:t xml:space="preserve">“Oh, you look very fancy in that," said Glory, and they walked back to Platt’s desk with a flutter of excitement for the evening to come. “With the helmet on, anyway.”</w:t>
       </w:r>
     </w:p>
     <w:p>
@@ -1723,7 +1868,7 @@
           <w:szCs w:val="28"/>
           <w:rtl w:val="0"/>
         </w:rPr>
-        <w:t xml:space="preserve">She pulled out her own weapon, a blade as short as her hand, finding a comfortable grip on it.</w:t>
+        <w:t xml:space="preserve">She pulled out her own weapon, a blade as short as her hand, seeking a comfortable grip on it.</w:t>
       </w:r>
     </w:p>
     <w:p>
@@ -1763,7 +1908,7 @@
           <w:szCs w:val="28"/>
           <w:rtl w:val="0"/>
         </w:rPr>
-        <w:t xml:space="preserve">Then there they were. Three men, seated on barrels and crates on the balcony, chatting to one another, laughing to one another, and sharing a glass bottle of dark wine. Their view was magnificent, and their heads were all turned to enjoy it, to the relief of the intruders. They sat just beyond the high hall crowned with the glass bridge, beyond a series of doorways with their great slabs of oak pinned open to allow the sea air to float in. </w:t>
+        <w:t xml:space="preserve">Then there they were. Three men, seated on barrels and crates on the balcony, chatting to one another, laughing to one another, and sharing a glass bottle of burgundy wine. Their view was magnificent, and their heads were all turned to enjoy it, to the relief of the intruders. They sat just beyond the high hall crowned with the glass bridge, beyond a series of doorways with their great slabs of oak pinned open to allow the sea air to float in. </w:t>
       </w:r>
     </w:p>
     <w:p>
@@ -2076,7 +2221,7 @@
           <w:szCs w:val="28"/>
           <w:rtl w:val="0"/>
         </w:rPr>
-        <w:t xml:space="preserve">“I’ll help you," she said, slowly dragging the point of her blade across his neck, watching the flesh part like freshly risen dough, releasing the blood to pour over his white skin, and white armour. “Any idea how many more?” she asked, turning her eyes away from the dying man at her feet, and rising to address the boys.</w:t>
+        <w:t xml:space="preserve">“I’ll help you," she said, dragging the point of her blade across his neck, watching the flesh part like freshly risen dough, releasing the blood to pour over his white skin, and white armour. “Any idea how many more?” she asked, turning her eyes away from the dying man at her feet, and rising to address the boys.</w:t>
       </w:r>
     </w:p>
     <w:p>
@@ -2118,7 +2263,7 @@
           <w:szCs w:val="28"/>
           <w:rtl w:val="0"/>
         </w:rPr>
-        <w:t xml:space="preserve">“You’re brilliant. Did you find the commander, the woman?” she asked.</w:t>
+        <w:t xml:space="preserve">“You’re brilliant. Did you see the commander, the woman?” she asked.</w:t>
       </w:r>
     </w:p>
     <w:p>
@@ -2273,7 +2418,7 @@
           <w:szCs w:val="28"/>
           <w:rtl w:val="0"/>
         </w:rPr>
-        <w:t xml:space="preserve">The three walked down the landside corridor, the dark courtyard beyond it barely visible through the warped glass.</w:t>
+        <w:t xml:space="preserve">The three walked down the landside corridor, the courtyard beyond it barely visible through the warped glass, as neglected as it was by all but moonlight.</w:t>
       </w:r>
     </w:p>
     <w:p>

</xml_diff>

<commit_message>
new chap 8 and scroll fix
</commit_message>
<xml_diff>
--- a/chapters/GTIchap8.docx
+++ b/chapters/GTIchap8.docx
@@ -310,7 +310,7 @@
           <w:szCs w:val="28"/>
           <w:rtl w:val="0"/>
         </w:rPr>
-        <w:t xml:space="preserve">Brynnis was the first to test its bearing, stepping from a crate and over the edge to stand on the ladder’s rail and shuffling silently across to the narrow walkway and steadying himself upon it. The ladder rattled as he stepped off, and Verne tightened his grip on its rail as Glory took the second journey to the cliff. </w:t>
+        <w:t xml:space="preserve">Brynnis was the first to test its bearing, stepping from a crate and over the edge to stand on the ladder’s rail and shuffling silently across to the narrow walkway and steadying himself upon it. The ladder rattled as he stepped off, and Verne tightened his grip on its rail as Glory took the second crossing to the cliff. </w:t>
       </w:r>
     </w:p>
     <w:p>
@@ -370,7 +370,7 @@
           <w:szCs w:val="28"/>
           <w:rtl w:val="0"/>
         </w:rPr>
-        <w:t xml:space="preserve">Verne started next, watching Brynnis disappear into shadow and Glory follow closely behind him, and his heart stopped for just a second as he reached the middle of the ladder and looked down into the glossy ripples waiting to swallow him from below. He waited as the boat drifted back to a steady position. Then, he tiptoed over the rungs and grabbed the wall to release his breath upon it in a great rush of energy. </w:t>
+        <w:t xml:space="preserve">Verne started next, watching Brynnis disappear into shadow and Glory follow closely behind him, and his heart paused for just a second as he reached the middle of the ladder and looked down into the glossy ripples waiting to swallow him from below. He waited as the boat drifted back to a steady position. Then, he tiptoed over the rungs and grabbed the wall to release his breath upon it in a great rush of energy. </w:t>
       </w:r>
     </w:p>
     <w:p>
@@ -490,7 +490,7 @@
           <w:szCs w:val="28"/>
           <w:rtl w:val="0"/>
         </w:rPr>
-        <w:t xml:space="preserve">They each made their way through the corridor, with soft steps and breaths, then stopped at the sight of a great titanium door ahead of them.</w:t>
+        <w:t xml:space="preserve">They each made their way through the corridor, with soft steps and breaths, then halted at the sight of a great titanium door ahead of them.</w:t>
       </w:r>
     </w:p>
     <w:p>
@@ -537,7 +537,6 @@
     </w:p>
     <w:p>
       <w:pPr>
-        <w:ind w:left="0" w:firstLine="0"/>
         <w:rPr>
           <w:rFonts w:ascii="Montserrat" w:cs="Montserrat" w:eastAsia="Montserrat" w:hAnsi="Montserrat"/>
           <w:color w:val="ffffff"/>
@@ -573,7 +572,7 @@
           <w:szCs w:val="28"/>
           <w:rtl w:val="0"/>
         </w:rPr>
-        <w:t xml:space="preserve">Then, he was disappeared, a magician’s trick leaving all observers truly stunned, leaving only a mirage in the air and a flicker of his form where he had stood a moment before. </w:t>
+        <w:t xml:space="preserve">Then, he disappeared, a magician’s trick leaving all observers truly stunned, as only a mirage in the air and a flicker of his form remained where he had stood a moment before. </w:t>
       </w:r>
     </w:p>
     <w:p>
@@ -785,7 +784,7 @@
           <w:szCs w:val="28"/>
           <w:rtl w:val="0"/>
         </w:rPr>
-        <w:t xml:space="preserve">He knelt quickly down, and allowed his vision to adjust to the room beyond the door; a large chamber with iron pillars twisting up to the ceiling, the dim light from a single strip encased in a glass frame on one of the far walls. He turned to the door and rose, orienting himself and finding his feet. </w:t>
+        <w:t xml:space="preserve">He knelt quickly down, and allowed his vision to adjust to the room on the other side of the door; a large chamber with iron pillars twisting up to the ceiling, the dim light from a single strip encased in a glass frame on one of the far walls. He turned to the door and rose, orienting himself and finding his feet. </w:t>
       </w:r>
     </w:p>
     <w:p>
@@ -917,7 +916,7 @@
           <w:szCs w:val="28"/>
           <w:rtl w:val="0"/>
         </w:rPr>
-        <w:t xml:space="preserve">“We’re right here," he murmered, and tried his best to use the very tip of his finger to indicate a small rectangle at the head of a snaking path, one of many divorced segments of shapes decorating the page. “This is cellar three. Up those steps and we’re in the west outer ring hall, ground level.”</w:t>
+        <w:t xml:space="preserve">“We’re right here," he murmured, and tried his best to use the very tip of his finger to indicate a small rectangle at the head of a snaking path, one of many divorced segments of shapes decorating the page. “This is cellar three. Up those steps and we’re in the west outer ring hall, ground level.”</w:t>
       </w:r>
     </w:p>
     <w:p>
@@ -985,23 +984,22 @@
     </w:p>
     <w:p>
       <w:pPr>
-        <w:ind w:left="0" w:firstLine="0"/>
-        <w:rPr>
-          <w:rFonts w:ascii="Montserrat" w:cs="Montserrat" w:eastAsia="Montserrat" w:hAnsi="Montserrat"/>
-          <w:color w:val="ffffff"/>
-          <w:sz w:val="28"/>
-          <w:szCs w:val="28"/>
-        </w:rPr>
-      </w:pPr>
-      <w:r>
-        <w:rPr>
-          <w:rFonts w:ascii="Montserrat" w:cs="Montserrat" w:eastAsia="Montserrat" w:hAnsi="Montserrat"/>
-          <w:color w:val="ffffff"/>
-          <w:sz w:val="28"/>
-          <w:szCs w:val="28"/>
-          <w:rtl w:val="0"/>
-        </w:rPr>
-        <w:t xml:space="preserve">Verne had already moved over to the barred door across the room. He peered through at the stairwell beyond, and saw the space caked in a shallow darkness. He knelt beside the lock and began to explore its innards with a pair of his own fine blades, twisting one way or the other, prodding and pushing at its bones until they clicked into place.</w:t>
+        <w:rPr>
+          <w:rFonts w:ascii="Montserrat" w:cs="Montserrat" w:eastAsia="Montserrat" w:hAnsi="Montserrat"/>
+          <w:color w:val="ffffff"/>
+          <w:sz w:val="28"/>
+          <w:szCs w:val="28"/>
+        </w:rPr>
+      </w:pPr>
+      <w:r>
+        <w:rPr>
+          <w:rFonts w:ascii="Montserrat" w:cs="Montserrat" w:eastAsia="Montserrat" w:hAnsi="Montserrat"/>
+          <w:color w:val="ffffff"/>
+          <w:sz w:val="28"/>
+          <w:szCs w:val="28"/>
+          <w:rtl w:val="0"/>
+        </w:rPr>
+        <w:t xml:space="preserve">Verne had already moved over to the barred door across the room. He peered through at the stairwell, and saw the space caked in a shallow darkness. He knelt beside the lock and began to explore its innards with a pair of his own fine blades, twisting one way or the other, prodding and pushing at its bones until they clicked into place.</w:t>
       </w:r>
     </w:p>
     <w:p>
@@ -1090,7 +1088,6 @@
     </w:p>
     <w:p>
       <w:pPr>
-        <w:ind w:left="0" w:firstLine="0"/>
         <w:rPr>
           <w:rFonts w:ascii="Montserrat" w:cs="Montserrat" w:eastAsia="Montserrat" w:hAnsi="Montserrat"/>
           <w:color w:val="ffffff"/>
@@ -1161,7 +1158,7 @@
           <w:szCs w:val="28"/>
           <w:rtl w:val="0"/>
         </w:rPr>
-        <w:t xml:space="preserve">At the top of the steps, the passage became welcomed the trio into an archway adjoined to the middle of a narrow corridor. The electric light from beneath them faded away, replaced by the buttery glow of firelight. </w:t>
+        <w:t xml:space="preserve">At the top of the steps, the passage welcomed the trio into an archway adjoined to the middle of a narrow corridor. The electric light from beneath them faded away, replaced by the buttery glow of firelight. </w:t>
       </w:r>
     </w:p>
     <w:p>
@@ -1227,7 +1224,6 @@
     </w:p>
     <w:p>
       <w:pPr>
-        <w:ind w:left="0" w:firstLine="0"/>
         <w:rPr>
           <w:rFonts w:ascii="Montserrat" w:cs="Montserrat" w:eastAsia="Montserrat" w:hAnsi="Montserrat"/>
           <w:color w:val="ffffff"/>
@@ -1550,7 +1546,7 @@
           <w:szCs w:val="28"/>
           <w:rtl w:val="0"/>
         </w:rPr>
-        <w:t xml:space="preserve">Glory grabbed him under his arms and dragged the guard’s corpse fairly effortlessly towards the archway, then beyond to the cellar steps that lay beyond it. </w:t>
+        <w:t xml:space="preserve">Glory grabbed him under his arms and dragged the guard’s corpse fairly effortlessly towards the archway, then beyond to the cellar steps.</w:t>
       </w:r>
     </w:p>
     <w:p>
@@ -1616,7 +1612,7 @@
     </w:p>
     <w:p>
       <w:pPr>
-        <w:ind w:left="0" w:firstLine="720"/>
+        <w:ind w:firstLine="720"/>
         <w:rPr>
           <w:rFonts w:ascii="Montserrat" w:cs="Montserrat" w:eastAsia="Montserrat" w:hAnsi="Montserrat"/>
           <w:color w:val="ffffff"/>
@@ -1637,7 +1633,7 @@
     </w:p>
     <w:p>
       <w:pPr>
-        <w:ind w:left="0" w:firstLine="720"/>
+        <w:ind w:firstLine="720"/>
         <w:rPr>
           <w:rFonts w:ascii="Montserrat" w:cs="Montserrat" w:eastAsia="Montserrat" w:hAnsi="Montserrat"/>
           <w:color w:val="ffffff"/>
@@ -1658,7 +1654,7 @@
     </w:p>
     <w:p>
       <w:pPr>
-        <w:ind w:left="0" w:firstLine="720"/>
+        <w:ind w:firstLine="720"/>
         <w:rPr>
           <w:rFonts w:ascii="Montserrat" w:cs="Montserrat" w:eastAsia="Montserrat" w:hAnsi="Montserrat"/>
           <w:color w:val="ffffff"/>
@@ -1828,27 +1824,47 @@
           <w:szCs w:val="28"/>
           <w:rtl w:val="0"/>
         </w:rPr>
-        <w:t xml:space="preserve">“That’s the western tower?” asked Verne, pointing over the bridge to a great open doorway and a rounded room beyond it. Glory nodded, and they treaded lightly over the glass, staring down at the floor, hundreds of feet below. </w:t>
-      </w:r>
-    </w:p>
-    <w:p>
-      <w:pPr>
-        <w:rPr>
-          <w:rFonts w:ascii="Montserrat" w:cs="Montserrat" w:eastAsia="Montserrat" w:hAnsi="Montserrat"/>
-          <w:color w:val="ffffff"/>
-          <w:sz w:val="28"/>
-          <w:szCs w:val="28"/>
-        </w:rPr>
-      </w:pPr>
-      <w:r>
-        <w:rPr>
-          <w:rFonts w:ascii="Montserrat" w:cs="Montserrat" w:eastAsia="Montserrat" w:hAnsi="Montserrat"/>
-          <w:color w:val="ffffff"/>
-          <w:sz w:val="28"/>
-          <w:szCs w:val="28"/>
-          <w:rtl w:val="0"/>
-        </w:rPr>
-        <w:t xml:space="preserve">They crossed into the circular room, defined by its staircases climbing up and down, hugging the walls, halting to connect with a floor, then continuing again. The bricks were red, contrasting the grey stone doorway, and nothing would stop a person from falling down the hole in the middle, cracking their skull on one of many a wooden beam, then meeting their end on the ground below. </w:t>
+        <w:t xml:space="preserve">“That’s the western tower?” asked Verne, pointing over the bridge to a tall, open arch guarding a rounded room. Glory nodded, and they treaded lightly over the glass, staring down at the floor, a hundreds feet below. </w:t>
+      </w:r>
+    </w:p>
+    <w:p>
+      <w:pPr>
+        <w:rPr>
+          <w:rFonts w:ascii="Montserrat" w:cs="Montserrat" w:eastAsia="Montserrat" w:hAnsi="Montserrat"/>
+          <w:color w:val="ffffff"/>
+          <w:sz w:val="28"/>
+          <w:szCs w:val="28"/>
+        </w:rPr>
+      </w:pPr>
+      <w:r>
+        <w:rPr>
+          <w:rFonts w:ascii="Montserrat" w:cs="Montserrat" w:eastAsia="Montserrat" w:hAnsi="Montserrat"/>
+          <w:color w:val="ffffff"/>
+          <w:sz w:val="28"/>
+          <w:szCs w:val="28"/>
+          <w:rtl w:val="0"/>
+        </w:rPr>
+        <w:t xml:space="preserve">They crossed into the tower, defined by its staircases climbing up and down the cylinder, spiralling, each step bored into the walls. The flow of the stairwells ceased only as the last step connected with a floor, then their path would continuing again to descent to the next level of the tower.</w:t>
+      </w:r>
+    </w:p>
+    <w:p>
+      <w:pPr>
+        <w:rPr>
+          <w:rFonts w:ascii="Montserrat" w:cs="Montserrat" w:eastAsia="Montserrat" w:hAnsi="Montserrat"/>
+          <w:color w:val="ffffff"/>
+          <w:sz w:val="28"/>
+          <w:szCs w:val="28"/>
+        </w:rPr>
+      </w:pPr>
+      <w:r>
+        <w:rPr>
+          <w:rFonts w:ascii="Montserrat" w:cs="Montserrat" w:eastAsia="Montserrat" w:hAnsi="Montserrat"/>
+          <w:color w:val="ffffff"/>
+          <w:sz w:val="28"/>
+          <w:szCs w:val="28"/>
+          <w:rtl w:val="0"/>
+        </w:rPr>
+        <w:t xml:space="preserve">The bricks were an earthen red, contrasting the grey stone threshold, and nothing would stop a person from falling down the hole in the middle, cracking their skull on one of many a wooden beam, then meeting their end on the ground below. </w:t>
       </w:r>
     </w:p>
     <w:p>
@@ -1929,7 +1945,47 @@
           <w:szCs w:val="28"/>
           <w:rtl w:val="0"/>
         </w:rPr>
-        <w:t xml:space="preserve">Then there they were. Three men, seated on barrels and crates on the balcony, chatting to one another, laughing to one another, and sharing a glass bottle of common cherry wine. Their view was magnificent, and their heads were all turned to enjoy it, to the relief of the intruders. They sat just beyond the high hall crowned with the glass bridge, beyond a series of doorways with their great slabs of oak pinned open to allow the sea air to float in. </w:t>
+        <w:t xml:space="preserve">Then there they were. Three men, seated on barrels and crates on the balcony, chatting to one another, laughing to one another, and sharing a glass bottle of common cherry wine. </w:t>
+      </w:r>
+    </w:p>
+    <w:p>
+      <w:pPr>
+        <w:rPr>
+          <w:rFonts w:ascii="Montserrat" w:cs="Montserrat" w:eastAsia="Montserrat" w:hAnsi="Montserrat"/>
+          <w:color w:val="ffffff"/>
+          <w:sz w:val="28"/>
+          <w:szCs w:val="28"/>
+        </w:rPr>
+      </w:pPr>
+      <w:r>
+        <w:rPr>
+          <w:rFonts w:ascii="Montserrat" w:cs="Montserrat" w:eastAsia="Montserrat" w:hAnsi="Montserrat"/>
+          <w:color w:val="ffffff"/>
+          <w:sz w:val="28"/>
+          <w:szCs w:val="28"/>
+          <w:rtl w:val="0"/>
+        </w:rPr>
+        <w:t xml:space="preserve">Their view was magnificent, and their heads were all turned to enjoy it.</w:t>
+      </w:r>
+    </w:p>
+    <w:p>
+      <w:pPr>
+        <w:rPr>
+          <w:rFonts w:ascii="Montserrat" w:cs="Montserrat" w:eastAsia="Montserrat" w:hAnsi="Montserrat"/>
+          <w:color w:val="ffffff"/>
+          <w:sz w:val="28"/>
+          <w:szCs w:val="28"/>
+        </w:rPr>
+      </w:pPr>
+      <w:r>
+        <w:rPr>
+          <w:rFonts w:ascii="Montserrat" w:cs="Montserrat" w:eastAsia="Montserrat" w:hAnsi="Montserrat"/>
+          <w:color w:val="ffffff"/>
+          <w:sz w:val="28"/>
+          <w:szCs w:val="28"/>
+          <w:rtl w:val="0"/>
+        </w:rPr>
+        <w:t xml:space="preserve">They sat just outside the high hall, past a series of open doors; great slabs of oak pinned open to allow the sea air to float in. </w:t>
       </w:r>
     </w:p>
     <w:p>
@@ -1975,7 +2031,7 @@
     </w:p>
     <w:p>
       <w:pPr>
-        <w:ind w:left="0" w:firstLine="720"/>
+        <w:ind w:firstLine="720"/>
         <w:rPr>
           <w:rFonts w:ascii="Montserrat" w:cs="Montserrat" w:eastAsia="Montserrat" w:hAnsi="Montserrat"/>
           <w:color w:val="ffffff"/>
@@ -1996,7 +2052,7 @@
     </w:p>
     <w:p>
       <w:pPr>
-        <w:ind w:left="0" w:firstLine="720"/>
+        <w:ind w:firstLine="720"/>
         <w:rPr>
           <w:rFonts w:ascii="Montserrat" w:cs="Montserrat" w:eastAsia="Montserrat" w:hAnsi="Montserrat"/>
           <w:color w:val="ffffff"/>
@@ -2017,7 +2073,7 @@
     </w:p>
     <w:p>
       <w:pPr>
-        <w:ind w:left="0" w:firstLine="720"/>
+        <w:ind w:firstLine="720"/>
         <w:rPr>
           <w:rFonts w:ascii="Montserrat" w:cs="Montserrat" w:eastAsia="Montserrat" w:hAnsi="Montserrat"/>
           <w:color w:val="ffffff"/>
@@ -2038,7 +2094,7 @@
     </w:p>
     <w:p>
       <w:pPr>
-        <w:ind w:left="0" w:firstLine="720"/>
+        <w:ind w:firstLine="720"/>
         <w:rPr>
           <w:rFonts w:ascii="Montserrat" w:cs="Montserrat" w:eastAsia="Montserrat" w:hAnsi="Montserrat"/>
           <w:color w:val="ffffff"/>
@@ -2059,7 +2115,7 @@
     </w:p>
     <w:p>
       <w:pPr>
-        <w:ind w:left="0" w:firstLine="720"/>
+        <w:ind w:firstLine="720"/>
         <w:rPr>
           <w:rFonts w:ascii="Montserrat" w:cs="Montserrat" w:eastAsia="Montserrat" w:hAnsi="Montserrat"/>
           <w:color w:val="ffffff"/>
@@ -2095,28 +2151,28 @@
           <w:szCs w:val="28"/>
           <w:rtl w:val="0"/>
         </w:rPr>
-        <w:t xml:space="preserve">Verne stepped towards the overlook, and Glory watched him closely, scuttling across the floor and crouching by the exterior wall. She shuffled ever closer to the doorway, glancing around at the wide hall. </w:t>
-      </w:r>
-    </w:p>
-    <w:p>
-      <w:pPr>
-        <w:ind w:firstLine="720"/>
-        <w:rPr>
-          <w:rFonts w:ascii="Montserrat" w:cs="Montserrat" w:eastAsia="Montserrat" w:hAnsi="Montserrat"/>
-          <w:color w:val="ffffff"/>
-          <w:sz w:val="28"/>
-          <w:szCs w:val="28"/>
-        </w:rPr>
-      </w:pPr>
-      <w:r>
-        <w:rPr>
-          <w:rFonts w:ascii="Montserrat" w:cs="Montserrat" w:eastAsia="Montserrat" w:hAnsi="Montserrat"/>
-          <w:color w:val="ffffff"/>
-          <w:sz w:val="28"/>
-          <w:szCs w:val="28"/>
-          <w:rtl w:val="0"/>
-        </w:rPr>
-        <w:t xml:space="preserve">“Erm, just needed some air," said Verne.</w:t>
+        <w:t xml:space="preserve">Verne stepped towards the overlook, and Glory watched him closely, scuttling across the floor and crouching by the exterior wall. She shuffled ever closer to him, glancing around at the wide hall for errant boots and faces. </w:t>
+      </w:r>
+    </w:p>
+    <w:p>
+      <w:pPr>
+        <w:ind w:firstLine="720"/>
+        <w:rPr>
+          <w:rFonts w:ascii="Montserrat" w:cs="Montserrat" w:eastAsia="Montserrat" w:hAnsi="Montserrat"/>
+          <w:color w:val="ffffff"/>
+          <w:sz w:val="28"/>
+          <w:szCs w:val="28"/>
+        </w:rPr>
+      </w:pPr>
+      <w:r>
+        <w:rPr>
+          <w:rFonts w:ascii="Montserrat" w:cs="Montserrat" w:eastAsia="Montserrat" w:hAnsi="Montserrat"/>
+          <w:color w:val="ffffff"/>
+          <w:sz w:val="28"/>
+          <w:szCs w:val="28"/>
+          <w:rtl w:val="0"/>
+        </w:rPr>
+        <w:t xml:space="preserve">“Erm, just needed some air," said Verne, the moonight cast through the glass bridge high above him shining dissipated on the pearly of his armoured shoulders.</w:t>
       </w:r>
     </w:p>
     <w:p>
@@ -2184,23 +2240,22 @@
     </w:p>
     <w:p>
       <w:pPr>
-        <w:ind w:left="0" w:firstLine="0"/>
-        <w:rPr>
-          <w:rFonts w:ascii="Montserrat" w:cs="Montserrat" w:eastAsia="Montserrat" w:hAnsi="Montserrat"/>
-          <w:color w:val="ffffff"/>
-          <w:sz w:val="28"/>
-          <w:szCs w:val="28"/>
-        </w:rPr>
-      </w:pPr>
-      <w:r>
-        <w:rPr>
-          <w:rFonts w:ascii="Montserrat" w:cs="Montserrat" w:eastAsia="Montserrat" w:hAnsi="Montserrat"/>
-          <w:color w:val="ffffff"/>
-          <w:sz w:val="28"/>
-          <w:szCs w:val="28"/>
-          <w:rtl w:val="0"/>
-        </w:rPr>
-        <w:t xml:space="preserve">The last life was to be claimed by Glory, leaping through the doorway to embed her blade into the third man’s shoulder. He cried out, and she grabbed his mouth to silence him. He clenched his jaw against her palm, and she winced in rage, before Verne slid his blade free and, still bloodied, pushed it into the man’s side, forcing it through the meat until it peeked out on the other end of him.</w:t>
+        <w:rPr>
+          <w:rFonts w:ascii="Montserrat" w:cs="Montserrat" w:eastAsia="Montserrat" w:hAnsi="Montserrat"/>
+          <w:color w:val="ffffff"/>
+          <w:sz w:val="28"/>
+          <w:szCs w:val="28"/>
+        </w:rPr>
+      </w:pPr>
+      <w:r>
+        <w:rPr>
+          <w:rFonts w:ascii="Montserrat" w:cs="Montserrat" w:eastAsia="Montserrat" w:hAnsi="Montserrat"/>
+          <w:color w:val="ffffff"/>
+          <w:sz w:val="28"/>
+          <w:szCs w:val="28"/>
+          <w:rtl w:val="0"/>
+        </w:rPr>
+        <w:t xml:space="preserve">The last life was to be claimed by Glory, leaping out onto the terrace to embed her blade into the third man’s shoulder. He cried out, and she grabbed his mouth to silence him. He clenched his jaw against her palm, and she winced in rage, before Verne slid his blade free and, still bloodied, pushed it into the man’s side, forcing it through the meat until it peeked out on the other end of him.</w:t>
       </w:r>
     </w:p>
     <w:p>
@@ -2346,7 +2401,7 @@
           <w:szCs w:val="28"/>
           <w:rtl w:val="0"/>
         </w:rPr>
-        <w:t xml:space="preserve">Brynn knelt down, staining his knees with blood to search the man’s overcoat. As he did, those dead eyes seemed to stare deeply into him. Black as the ocean beyond the overlook, and his slender iris rings were a deep red. </w:t>
+        <w:t xml:space="preserve">Brynn knelt down, staining his knees with blood to search the man’s overcoat. As he did, those eyes seemed so alive. They were black as the ocean below the overlook, and his slender iris rings were a deep red. </w:t>
       </w:r>
     </w:p>
     <w:p>
@@ -2480,28 +2535,28 @@
           <w:szCs w:val="28"/>
           <w:rtl w:val="0"/>
         </w:rPr>
-        <w:t xml:space="preserve">The three walked down the landside corridor, the courtyard beyond it barely visible through the warped glass, as neglected as it was by all but moonlight.</w:t>
-      </w:r>
-    </w:p>
-    <w:p>
-      <w:pPr>
-        <w:ind w:firstLine="720"/>
-        <w:rPr>
-          <w:rFonts w:ascii="Montserrat" w:cs="Montserrat" w:eastAsia="Montserrat" w:hAnsi="Montserrat"/>
-          <w:color w:val="ffffff"/>
-          <w:sz w:val="28"/>
-          <w:szCs w:val="28"/>
-        </w:rPr>
-      </w:pPr>
-      <w:r>
-        <w:rPr>
-          <w:rFonts w:ascii="Montserrat" w:cs="Montserrat" w:eastAsia="Montserrat" w:hAnsi="Montserrat"/>
-          <w:color w:val="ffffff"/>
-          <w:sz w:val="28"/>
-          <w:szCs w:val="28"/>
-          <w:rtl w:val="0"/>
-        </w:rPr>
-        <w:t xml:space="preserve">“This is clear, and I already turned off power to the radial alarm," said Brynn, and Glory’s eye caught a stream of blood running from a doorway ahead of them. They passed it and she glanced in to see another man face down on the ground, his long hair strewn through the pool, strands clinging to one another. </w:t>
+        <w:t xml:space="preserve">The three walked down the landside corridor, the courtyard outside of it barely visible through the warped glass, as neglected as it was by all but moonlight.</w:t>
+      </w:r>
+    </w:p>
+    <w:p>
+      <w:pPr>
+        <w:ind w:firstLine="720"/>
+        <w:rPr>
+          <w:rFonts w:ascii="Montserrat" w:cs="Montserrat" w:eastAsia="Montserrat" w:hAnsi="Montserrat"/>
+          <w:color w:val="ffffff"/>
+          <w:sz w:val="28"/>
+          <w:szCs w:val="28"/>
+        </w:rPr>
+      </w:pPr>
+      <w:r>
+        <w:rPr>
+          <w:rFonts w:ascii="Montserrat" w:cs="Montserrat" w:eastAsia="Montserrat" w:hAnsi="Montserrat"/>
+          <w:color w:val="ffffff"/>
+          <w:sz w:val="28"/>
+          <w:szCs w:val="28"/>
+          <w:rtl w:val="0"/>
+        </w:rPr>
+        <w:t xml:space="preserve">“This is clear, and I already turned off power to the radial alarm," said Brynn, and Glory’s eye caught a stream of blood running from an entryway ahead of them. They passed it and she glanced in to see another man face down on the ground, his long hair strewn through the pool, strands clinging to one another. </w:t>
       </w:r>
     </w:p>
     <w:p>
@@ -2650,6 +2705,24 @@
         </w:rPr>
         <w:t xml:space="preserve">“Talk," she said, then proceeded to listen.  </w:t>
       </w:r>
+      <w:r>
+        <w:rPr>
+          <w:rtl w:val="0"/>
+        </w:rPr>
+      </w:r>
+    </w:p>
+    <w:p>
+      <w:pPr>
+        <w:ind w:left="720" w:firstLine="0"/>
+        <w:rPr>
+          <w:rFonts w:ascii="Montserrat" w:cs="Montserrat" w:eastAsia="Montserrat" w:hAnsi="Montserrat"/>
+          <w:b w:val="1"/>
+          <w:bCs w:val="1"/>
+          <w:color w:val="ffffff"/>
+          <w:sz w:val="48"/>
+          <w:szCs w:val="48"/>
+        </w:rPr>
+      </w:pPr>
       <w:r>
         <w:rPr>
           <w:rtl w:val="0"/>

</xml_diff>